<commit_message>
ADR-10: proponer manejo global de errores HTTP con interceptor
</commit_message>
<xml_diff>
--- a/docs/ADR/ADR-09-domain-api-service.docx
+++ b/docs/ADR/ADR-09-domain-api-service.docx
@@ -862,27 +862,11 @@
     </w:p>
     <w:p>
       <w:r>
-        <w:t>• users-</w:t>
-      </w:r>
-      <w:proofErr w:type="gramStart"/>
-      <w:r>
-        <w:t>api.service</w:t>
-      </w:r>
-      <w:proofErr w:type="gramEnd"/>
-      <w:r>
-        <w:t>.ts</w:t>
+        <w:t>• users-api.service.ts</w:t>
       </w:r>
       <w:r>
         <w:br/>
-        <w:t xml:space="preserve">• </w:t>
-      </w:r>
-      <w:proofErr w:type="gramStart"/>
-      <w:r>
-        <w:t>users.component</w:t>
-      </w:r>
-      <w:proofErr w:type="gramEnd"/>
-      <w:r>
-        <w:t>.ts</w:t>
+        <w:t>• users.component.ts</w:t>
       </w:r>
     </w:p>
     <w:p>
@@ -958,15 +942,7 @@
     </w:p>
     <w:p>
       <w:r>
-        <w:t>• users-</w:t>
-      </w:r>
-      <w:proofErr w:type="gramStart"/>
-      <w:r>
-        <w:t>api.service</w:t>
-      </w:r>
-      <w:proofErr w:type="gramEnd"/>
-      <w:r>
-        <w:t>.ts</w:t>
+        <w:t>• users-api.service.ts</w:t>
       </w:r>
     </w:p>
     <w:p>
@@ -986,15 +962,7 @@
     </w:p>
     <w:p>
       <w:r>
-        <w:t xml:space="preserve">• </w:t>
-      </w:r>
-      <w:proofErr w:type="gramStart"/>
-      <w:r>
-        <w:t>users.component</w:t>
-      </w:r>
-      <w:proofErr w:type="gramEnd"/>
-      <w:r>
-        <w:t>.ts</w:t>
+        <w:t>• users.component.ts</w:t>
       </w:r>
     </w:p>
     <w:p>
@@ -1038,52 +1006,18 @@
       </w:r>
     </w:p>
     <w:p>
-      <w:proofErr w:type="gramStart"/>
       <w:r>
-        <w:t>constructor(</w:t>
-      </w:r>
-      <w:proofErr w:type="gramEnd"/>
-      <w:r>
-        <w:t>private fb: FormBuilder, private api: ApiService, private notify: NotificationService) {}</w:t>
+        <w:t>constructor(private fb: FormBuilder, private api: ApiService, private notify: NotificationService) {}</w:t>
       </w:r>
     </w:p>
     <w:p>
       <w:r>
-        <w:t xml:space="preserve">y en el método </w:t>
-      </w:r>
-      <w:proofErr w:type="gramStart"/>
-      <w:r>
-        <w:t>submit(</w:t>
-      </w:r>
-      <w:proofErr w:type="gramEnd"/>
-      <w:r>
-        <w:t>) se invocaba:</w:t>
+        <w:t>y en el método submit() se invocaba:</w:t>
       </w:r>
     </w:p>
     <w:p>
-      <w:proofErr w:type="gramStart"/>
       <w:r>
-        <w:t>this.api.createUser</w:t>
-      </w:r>
-      <w:proofErr w:type="gramEnd"/>
-      <w:r>
-        <w:t>(</w:t>
-      </w:r>
-      <w:proofErr w:type="gramStart"/>
-      <w:r>
-        <w:t>email!</w:t>
-      </w:r>
-      <w:proofErr w:type="gramEnd"/>
-      <w:r>
-        <w:t>, password!</w:t>
-      </w:r>
-      <w:proofErr w:type="gramStart"/>
-      <w:r>
-        <w:t>).subscribe</w:t>
-      </w:r>
-      <w:proofErr w:type="gramEnd"/>
-      <w:r>
-        <w:t>(...)</w:t>
+        <w:t>this.api.createUser(email!, password!).subscribe(...)</w:t>
       </w:r>
     </w:p>
     <w:p>
@@ -1093,6 +1027,9 @@
     </w:p>
     <w:p>
       <w:r>
+        <w:rPr>
+          <w:noProof/>
+        </w:rPr>
         <w:drawing>
           <wp:inline distT="0" distB="0" distL="0" distR="0" wp14:anchorId="772B637B" wp14:editId="56944C69">
             <wp:extent cx="2629267" cy="1371791"/>
@@ -1132,6 +1069,9 @@
     </w:p>
     <w:p>
       <w:r>
+        <w:rPr>
+          <w:noProof/>
+        </w:rPr>
         <w:lastRenderedPageBreak/>
         <w:drawing>
           <wp:inline distT="0" distB="0" distL="0" distR="0" wp14:anchorId="6B016B8B" wp14:editId="3087A923">
@@ -1173,6 +1113,9 @@
     <w:p/>
     <w:p>
       <w:r>
+        <w:rPr>
+          <w:noProof/>
+        </w:rPr>
         <w:drawing>
           <wp:inline distT="0" distB="0" distL="0" distR="0" wp14:anchorId="035479F0" wp14:editId="5AD6AF3F">
             <wp:extent cx="5612130" cy="3128645"/>
@@ -1241,52 +1184,18 @@
       </w:r>
     </w:p>
     <w:p>
-      <w:proofErr w:type="gramStart"/>
       <w:r>
-        <w:t>constructor(</w:t>
-      </w:r>
-      <w:proofErr w:type="gramEnd"/>
-      <w:r>
-        <w:t>private fb: FormBuilder, private usersApi: UsersApiService, private notify: NotificationService) {}</w:t>
+        <w:t>constructor(private fb: FormBuilder, private usersApi: UsersApiService, private notify: NotificationService) {}</w:t>
       </w:r>
     </w:p>
     <w:p>
       <w:r>
-        <w:t xml:space="preserve">Además, la llamada del método </w:t>
-      </w:r>
-      <w:proofErr w:type="gramStart"/>
-      <w:r>
-        <w:t>submit(</w:t>
-      </w:r>
-      <w:proofErr w:type="gramEnd"/>
-      <w:r>
-        <w:t>) quedó delegada al servicio de dominio:</w:t>
+        <w:t>Además, la llamada del método submit() quedó delegada al servicio de dominio:</w:t>
       </w:r>
     </w:p>
     <w:p>
-      <w:proofErr w:type="gramStart"/>
       <w:r>
-        <w:t>this.usersApi.createUser</w:t>
-      </w:r>
-      <w:proofErr w:type="gramEnd"/>
-      <w:r>
-        <w:t>(</w:t>
-      </w:r>
-      <w:proofErr w:type="gramStart"/>
-      <w:r>
-        <w:t>email!</w:t>
-      </w:r>
-      <w:proofErr w:type="gramEnd"/>
-      <w:r>
-        <w:t>, password!</w:t>
-      </w:r>
-      <w:proofErr w:type="gramStart"/>
-      <w:r>
-        <w:t>).subscribe</w:t>
-      </w:r>
-      <w:proofErr w:type="gramEnd"/>
-      <w:r>
-        <w:t>(...)</w:t>
+        <w:t>this.usersApi.createUser(email!, password!).subscribe(...)</w:t>
       </w:r>
     </w:p>
     <w:p>
@@ -1302,6 +1211,9 @@
         </w:rPr>
       </w:pPr>
       <w:r>
+        <w:rPr>
+          <w:noProof/>
+        </w:rPr>
         <w:drawing>
           <wp:inline distT="0" distB="0" distL="0" distR="0" wp14:anchorId="77B38627" wp14:editId="3D2E73DD">
             <wp:extent cx="5612130" cy="1001395"/>
@@ -1340,23 +1252,16 @@
       </w:r>
       <w:r>
         <w:rPr>
-          <w:rFonts w:ascii="Segoe UI Emoji" w:hAnsi="Segoe UI Emoji" w:cs="Segoe UI Emoji"/>
           <w:b/>
           <w:bCs/>
         </w:rPr>
-        <w:t>📌</w:t>
+        <w:t xml:space="preserve"> </w:t>
       </w:r>
       <w:r>
         <w:rPr>
           <w:b/>
           <w:bCs/>
-        </w:rPr>
-        <w:t xml:space="preserve"> Captura </w:t>
-      </w:r>
-      <w:r>
-        <w:rPr>
-          <w:b/>
-          <w:bCs/>
+          <w:noProof/>
         </w:rPr>
         <w:lastRenderedPageBreak/>
         <w:drawing>
@@ -1501,6 +1406,9 @@
     </w:p>
     <w:p>
       <w:r>
+        <w:rPr>
+          <w:noProof/>
+        </w:rPr>
         <w:lastRenderedPageBreak/>
         <w:drawing>
           <wp:inline distT="0" distB="0" distL="0" distR="0" wp14:anchorId="64700151" wp14:editId="37EF602F">
@@ -24284,6 +24192,7 @@
   <w:style w:type="character" w:default="1" w:styleId="Fuentedeprrafopredeter">
     <w:name w:val="Default Paragraph Font"/>
     <w:uiPriority w:val="1"/>
+    <w:semiHidden/>
     <w:unhideWhenUsed/>
   </w:style>
   <w:style w:type="table" w:default="1" w:styleId="Tablanormal">

</xml_diff>

<commit_message>
ADR-09: dividir acceso HTTP por dominio con UsersApiService
</commit_message>
<xml_diff>
--- a/docs/ADR/ADR-09-domain-api-service.docx
+++ b/docs/ADR/ADR-09-domain-api-service.docx
@@ -862,27 +862,11 @@
     </w:p>
     <w:p>
       <w:r>
-        <w:t>• users-</w:t>
-      </w:r>
-      <w:proofErr w:type="gramStart"/>
-      <w:r>
-        <w:t>api.service</w:t>
-      </w:r>
-      <w:proofErr w:type="gramEnd"/>
-      <w:r>
-        <w:t>.ts</w:t>
+        <w:t>• users-api.service.ts</w:t>
       </w:r>
       <w:r>
         <w:br/>
-        <w:t xml:space="preserve">• </w:t>
-      </w:r>
-      <w:proofErr w:type="gramStart"/>
-      <w:r>
-        <w:t>users.component</w:t>
-      </w:r>
-      <w:proofErr w:type="gramEnd"/>
-      <w:r>
-        <w:t>.ts</w:t>
+        <w:t>• users.component.ts</w:t>
       </w:r>
     </w:p>
     <w:p>
@@ -958,15 +942,7 @@
     </w:p>
     <w:p>
       <w:r>
-        <w:t>• users-</w:t>
-      </w:r>
-      <w:proofErr w:type="gramStart"/>
-      <w:r>
-        <w:t>api.service</w:t>
-      </w:r>
-      <w:proofErr w:type="gramEnd"/>
-      <w:r>
-        <w:t>.ts</w:t>
+        <w:t>• users-api.service.ts</w:t>
       </w:r>
     </w:p>
     <w:p>
@@ -986,15 +962,7 @@
     </w:p>
     <w:p>
       <w:r>
-        <w:t xml:space="preserve">• </w:t>
-      </w:r>
-      <w:proofErr w:type="gramStart"/>
-      <w:r>
-        <w:t>users.component</w:t>
-      </w:r>
-      <w:proofErr w:type="gramEnd"/>
-      <w:r>
-        <w:t>.ts</w:t>
+        <w:t>• users.component.ts</w:t>
       </w:r>
     </w:p>
     <w:p>
@@ -1038,52 +1006,18 @@
       </w:r>
     </w:p>
     <w:p>
-      <w:proofErr w:type="gramStart"/>
       <w:r>
-        <w:t>constructor(</w:t>
-      </w:r>
-      <w:proofErr w:type="gramEnd"/>
-      <w:r>
-        <w:t>private fb: FormBuilder, private api: ApiService, private notify: NotificationService) {}</w:t>
+        <w:t>constructor(private fb: FormBuilder, private api: ApiService, private notify: NotificationService) {}</w:t>
       </w:r>
     </w:p>
     <w:p>
       <w:r>
-        <w:t xml:space="preserve">y en el método </w:t>
-      </w:r>
-      <w:proofErr w:type="gramStart"/>
-      <w:r>
-        <w:t>submit(</w:t>
-      </w:r>
-      <w:proofErr w:type="gramEnd"/>
-      <w:r>
-        <w:t>) se invocaba:</w:t>
+        <w:t>y en el método submit() se invocaba:</w:t>
       </w:r>
     </w:p>
     <w:p>
-      <w:proofErr w:type="gramStart"/>
       <w:r>
-        <w:t>this.api.createUser</w:t>
-      </w:r>
-      <w:proofErr w:type="gramEnd"/>
-      <w:r>
-        <w:t>(</w:t>
-      </w:r>
-      <w:proofErr w:type="gramStart"/>
-      <w:r>
-        <w:t>email!</w:t>
-      </w:r>
-      <w:proofErr w:type="gramEnd"/>
-      <w:r>
-        <w:t>, password!</w:t>
-      </w:r>
-      <w:proofErr w:type="gramStart"/>
-      <w:r>
-        <w:t>).subscribe</w:t>
-      </w:r>
-      <w:proofErr w:type="gramEnd"/>
-      <w:r>
-        <w:t>(...)</w:t>
+        <w:t>this.api.createUser(email!, password!).subscribe(...)</w:t>
       </w:r>
     </w:p>
     <w:p>
@@ -1093,6 +1027,9 @@
     </w:p>
     <w:p>
       <w:r>
+        <w:rPr>
+          <w:noProof/>
+        </w:rPr>
         <w:drawing>
           <wp:inline distT="0" distB="0" distL="0" distR="0" wp14:anchorId="772B637B" wp14:editId="56944C69">
             <wp:extent cx="2629267" cy="1371791"/>
@@ -1132,6 +1069,9 @@
     </w:p>
     <w:p>
       <w:r>
+        <w:rPr>
+          <w:noProof/>
+        </w:rPr>
         <w:lastRenderedPageBreak/>
         <w:drawing>
           <wp:inline distT="0" distB="0" distL="0" distR="0" wp14:anchorId="6B016B8B" wp14:editId="3087A923">
@@ -1173,6 +1113,9 @@
     <w:p/>
     <w:p>
       <w:r>
+        <w:rPr>
+          <w:noProof/>
+        </w:rPr>
         <w:drawing>
           <wp:inline distT="0" distB="0" distL="0" distR="0" wp14:anchorId="035479F0" wp14:editId="5AD6AF3F">
             <wp:extent cx="5612130" cy="3128645"/>
@@ -1241,52 +1184,18 @@
       </w:r>
     </w:p>
     <w:p>
-      <w:proofErr w:type="gramStart"/>
       <w:r>
-        <w:t>constructor(</w:t>
-      </w:r>
-      <w:proofErr w:type="gramEnd"/>
-      <w:r>
-        <w:t>private fb: FormBuilder, private usersApi: UsersApiService, private notify: NotificationService) {}</w:t>
+        <w:t>constructor(private fb: FormBuilder, private usersApi: UsersApiService, private notify: NotificationService) {}</w:t>
       </w:r>
     </w:p>
     <w:p>
       <w:r>
-        <w:t xml:space="preserve">Además, la llamada del método </w:t>
-      </w:r>
-      <w:proofErr w:type="gramStart"/>
-      <w:r>
-        <w:t>submit(</w:t>
-      </w:r>
-      <w:proofErr w:type="gramEnd"/>
-      <w:r>
-        <w:t>) quedó delegada al servicio de dominio:</w:t>
+        <w:t>Además, la llamada del método submit() quedó delegada al servicio de dominio:</w:t>
       </w:r>
     </w:p>
     <w:p>
-      <w:proofErr w:type="gramStart"/>
       <w:r>
-        <w:t>this.usersApi.createUser</w:t>
-      </w:r>
-      <w:proofErr w:type="gramEnd"/>
-      <w:r>
-        <w:t>(</w:t>
-      </w:r>
-      <w:proofErr w:type="gramStart"/>
-      <w:r>
-        <w:t>email!</w:t>
-      </w:r>
-      <w:proofErr w:type="gramEnd"/>
-      <w:r>
-        <w:t>, password!</w:t>
-      </w:r>
-      <w:proofErr w:type="gramStart"/>
-      <w:r>
-        <w:t>).subscribe</w:t>
-      </w:r>
-      <w:proofErr w:type="gramEnd"/>
-      <w:r>
-        <w:t>(...)</w:t>
+        <w:t>this.usersApi.createUser(email!, password!).subscribe(...)</w:t>
       </w:r>
     </w:p>
     <w:p>
@@ -1302,6 +1211,9 @@
         </w:rPr>
       </w:pPr>
       <w:r>
+        <w:rPr>
+          <w:noProof/>
+        </w:rPr>
         <w:drawing>
           <wp:inline distT="0" distB="0" distL="0" distR="0" wp14:anchorId="77B38627" wp14:editId="3D2E73DD">
             <wp:extent cx="5612130" cy="1001395"/>
@@ -1340,23 +1252,9 @@
       </w:r>
       <w:r>
         <w:rPr>
-          <w:rFonts w:ascii="Segoe UI Emoji" w:hAnsi="Segoe UI Emoji" w:cs="Segoe UI Emoji"/>
           <w:b/>
           <w:bCs/>
-        </w:rPr>
-        <w:t>📌</w:t>
-      </w:r>
-      <w:r>
-        <w:rPr>
-          <w:b/>
-          <w:bCs/>
-        </w:rPr>
-        <w:t xml:space="preserve"> Captura </w:t>
-      </w:r>
-      <w:r>
-        <w:rPr>
-          <w:b/>
-          <w:bCs/>
+          <w:noProof/>
         </w:rPr>
         <w:lastRenderedPageBreak/>
         <w:drawing>
@@ -1501,6 +1399,9 @@
     </w:p>
     <w:p>
       <w:r>
+        <w:rPr>
+          <w:noProof/>
+        </w:rPr>
         <w:lastRenderedPageBreak/>
         <w:drawing>
           <wp:inline distT="0" distB="0" distL="0" distR="0" wp14:anchorId="64700151" wp14:editId="37EF602F">
@@ -24284,6 +24185,7 @@
   <w:style w:type="character" w:default="1" w:styleId="Fuentedeprrafopredeter">
     <w:name w:val="Default Paragraph Font"/>
     <w:uiPriority w:val="1"/>
+    <w:semiHidden/>
     <w:unhideWhenUsed/>
   </w:style>
   <w:style w:type="table" w:default="1" w:styleId="Tablanormal">

</xml_diff>